<commit_message>
eSIM contract: simplify 8.3 (drop min-order binding), move discount condition to Annex 01
Per reviewer: remove minimum-order-quantity binding from 8.3; note in discount
policy that discount applies year 1, and Ben A may reconsider rate if revenue
target not met in later years. Remove leftover struck non-compete duplicate.

https://claude.ai/code/session_0133sCYP62GY9C9jKN3N5vJE
</commit_message>
<xml_diff>
--- a/output/HopDong_DaiLy_eSIM_SUA_THEO_GOPY.docx
+++ b/output/HopDong_DaiLy_eSIM_SUA_THEO_GOPY.docx
@@ -1943,49 +1943,6 @@
         <w:ind w:left="360"/>
         <w:jc w:val="both"/>
         <w:rPr>
-          <w:sz w:val="22"/>
-        </w:rPr>
-      </w:pPr>
-      <w:r>
-        <w:rPr>
-          <w:strike/>
-          <w:color w:val="808080"/>
-        </w:rPr>
-        <w:t xml:space="preserve">8.3. </w:t>
-      </w:r>
-      <w:r>
-        <w:rPr>
-          <w:b/>
-          <w:bCs/>
-          <w:strike/>
-          <w:color w:val="808080"/>
-        </w:rPr>
-        <w:t xml:space="preserve">Nguồn cung ứng: </w:t>
-      </w:r>
-      <w:commentRangeStart w:id="4"/>
-      <w:r>
-        <w:rPr>
-          <w:strike/>
-          <w:color w:val="808080"/>
-        </w:rPr>
-        <w:t xml:space="preserve">Bên A là nhà cung cấp chính thức của Bên B đối với Sản phẩm. Trong thời hạn Hợp đồng và trong 12 (mười hai) tháng kể từ ngày chấm dứt Hợp đồng, Bên B cam kết KHÔNG, trực tiếp hoặc gián tiếp, thông qua bất kỳ cá nhân/tổ chức liên quan nào: xác định, tiếp cận, liên hệ, đàm phán, ký kết hoặc giao dịch với nhà cung cấp khác Bên A nhằm mua, phân phối Sản phẩm hoặc sản phẩm tương tự, hoặc nhằm vượt qua Bên A để hưởng lợi từ quan hệ cung ứng của Bên </w:t>
-      </w:r>
-      <w:commentRangeEnd w:id="4"/>
-      <w:r>
-        <w:rPr>
-          <w:rStyle w:val="CommentReference"/>
-          <w:sz w:val="22"/>
-          <w:szCs w:val="24"/>
-        </w:rPr>
-        <w:commentReference w:id="4"/>
-      </w:r>
-    </w:p>
-    <w:p>
-      <w:pPr>
-        <w:spacing w:after="100" w:line="276" w:lineRule="auto"/>
-        <w:ind w:left="360"/>
-        <w:jc w:val="both"/>
-        <w:rPr>
           <w:highlight w:val="yellow"/>
         </w:rPr>
       </w:pPr>
@@ -1993,43 +1950,37 @@
         <w:rPr>
           <w:highlight w:val="yellow"/>
         </w:rPr>
-        <w:t xml:space="preserve">8.3. Nguồn cung ứng và ràng buộc </w:t>
+        <w:t>8.3. Nguồn cung ứng: Bên A là nhà cung cấp chính thức của Bên B đối với Sản phẩm theo Hợp đồng này.</w:t>
       </w:r>
       <w:r>
         <w:rPr>
           <w:highlight w:val="yellow"/>
         </w:rPr>
-        <w:t>số lượng đơn đặt hàng</w:t>
       </w:r>
       <w:r>
         <w:rPr>
           <w:highlight w:val="yellow"/>
         </w:rPr>
-        <w:t xml:space="preserve">: Bên A là nhà cung cấp chính thức của Bên B đối với Sản phẩm. Hai Bên không áp dụng hạn chế cạnh tranh; thay vào đó, để được tiếp tục hưởng các chính sách giá, chiết khấu và ưu đãi của Bên A, Bên B cam kết đạt </w:t>
       </w:r>
       <w:r>
         <w:rPr>
           <w:highlight w:val="yellow"/>
         </w:rPr>
-        <w:t>số lượng đặt hàng tối thiểu</w:t>
       </w:r>
       <w:r>
         <w:rPr>
           <w:highlight w:val="yellow"/>
         </w:rPr>
-        <w:t xml:space="preserve"> theo thỏa thuận tại Phụ lục 01. Trường hợp Bên B không đạt </w:t>
       </w:r>
       <w:r>
         <w:rPr>
           <w:highlight w:val="yellow"/>
         </w:rPr>
-        <w:t>số lượng đặt hàng</w:t>
       </w:r>
       <w:r>
         <w:rPr>
           <w:highlight w:val="yellow"/>
         </w:rPr>
-        <w:t xml:space="preserve"> tối thiểu, Bên A có quyền điều chỉnh chính sách giá/chiết khấu hoặc xem xét lại điều kiện hợp tác, nhưng không hạn chế quyền kinh doanh hợp pháp của Bên B. </w:t>
       </w:r>
     </w:p>
     <w:p>
@@ -3593,6 +3544,24 @@
           <w:bCs/>
         </w:rPr>
         <w:t xml:space="preserve">*Áp dụng cho tất cả sản phẩm/gói cước </w:t>
+      </w:r>
+    </w:p>
+    <w:p>
+      <w:pPr>
+        <w:spacing w:after="80" w:line="276" w:lineRule="auto"/>
+        <w:jc w:val="both"/>
+        <w:rPr>
+          <w:b/>
+          <w:bCs/>
+        </w:rPr>
+      </w:pPr>
+      <w:r>
+        <w:rPr>
+          <w:rFonts w:ascii="Times New Roman" w:hAnsi="Times New Roman"/>
+          <w:sz w:val="26"/>
+          <w:highlight w:val="yellow"/>
+        </w:rPr>
+        <w:t>Chính sách chiết khấu nêu trên áp dụng cho năm đầu tiên của Hợp đồng. Từ năm thứ hai trở đi, nếu Bên B không đạt doanh thu tối thiểu …… VNĐ/năm (hoặc mức sản lượng do Hai Bên thỏa thuận), Bên A có quyền xem xét, điều chỉnh lại tỷ lệ chiết khấu áp dụng cho Bên B.</w:t>
       </w:r>
     </w:p>
     <w:p>

</xml_diff>